<commit_message>
Informe: despliegue en el servidor del centro, sección de seguridad, nuevas funciones y anexos con capturas
Co-Authored-By: Claude Opus 5.5 <noreply@anthropic.com>
</commit_message>
<xml_diff>
--- a/docs/Informe-implementacion-sitio-web-CEAC.docx
+++ b/docs/Informe-implementacion-sitio-web-CEAC.docx
@@ -851,9 +851,32 @@
             </w:tabs>
             <w:ind w:left="220"/>
           </w:pPr>
+          <w:hyperlink w:history="1" w:anchor="_Toc90">
+            <w:r>
+              <w:t xml:space="preserve">3.7 Seguridad</w:t>
+            </w:r>
+            <w:r>
+              <w:tab/>
+            </w:r>
+            <w:r>
+              <w:fldChar w:fldCharType="begin" w:dirty="true"/>
+              <w:instrText xml:space="preserve">PAGEREF _Toc25 \h</w:instrText>
+              <w:fldChar w:fldCharType="separate"/>
+              <w:fldChar w:fldCharType="end"/>
+            </w:r>
+          </w:hyperlink>
+        </w:p>
+        <w:p>
+          <w:pPr>
+            <w:pStyle w:val="TOC2"/>
+            <w:tabs>
+              <w:tab w:val="right" w:pos="9071" w:leader="dot"/>
+            </w:tabs>
+            <w:ind w:left="220"/>
+          </w:pPr>
           <w:hyperlink w:history="1" w:anchor="_Toc25">
             <w:r>
-              <w:t xml:space="preserve">3.7 Verificación y validación</w:t>
+              <w:t xml:space="preserve">3.8 Verificación y validación</w:t>
             </w:r>
             <w:r>
               <w:tab/>
@@ -876,7 +899,7 @@
           </w:pPr>
           <w:hyperlink w:history="1" w:anchor="_Toc26">
             <w:r>
-              <w:t xml:space="preserve">3.8 Resultados</w:t>
+              <w:t xml:space="preserve">3.9 Resultados</w:t>
             </w:r>
             <w:r>
               <w:tab/>
@@ -2407,7 +2430,7 @@
                 <w:sz w:val="20"/>
                 <w:szCs w:val="20"/>
               </w:rPr>
-              <w:t xml:space="preserve">—</w:t>
+              <w:t xml:space="preserve">18 / —</w:t>
             </w:r>
           </w:p>
         </w:tc>
@@ -2434,7 +2457,7 @@
                 <w:sz w:val="20"/>
                 <w:szCs w:val="20"/>
               </w:rPr>
-              <w:t xml:space="preserve">Base de datos de producción (Neon) y de desarrollo (archivo local)</w:t>
+              <w:t xml:space="preserve">Base de datos: PostgreSQL en el servidor del centro (producción) y SQLite (desarrollo)</w:t>
             </w:r>
           </w:p>
         </w:tc>
@@ -2778,7 +2801,7 @@
                 <w:sz w:val="20"/>
                 <w:szCs w:val="20"/>
               </w:rPr>
-              <w:t xml:space="preserve">Almacenamiento y entrega de imágenes en producción</w:t>
+              <w:t xml:space="preserve">Almacenamiento de las imágenes publicadas (temporal; se trasladarán al servidor del centro)</w:t>
             </w:r>
           </w:p>
         </w:tc>
@@ -2950,7 +2973,7 @@
                 <w:sz w:val="20"/>
                 <w:szCs w:val="20"/>
               </w:rPr>
-              <w:t xml:space="preserve">Control de versiones con una rama por tarea</w:t>
+              <w:t xml:space="preserve">Control de versiones con una rama por tarea; GitHub Actions revisa y despliega cada cambio</w:t>
             </w:r>
           </w:p>
         </w:tc>
@@ -2982,7 +3005,7 @@
                 <w:sz w:val="20"/>
                 <w:szCs w:val="20"/>
               </w:rPr>
-              <w:t xml:space="preserve">Vercel</w:t>
+              <w:t xml:space="preserve">Nginx y Let's Encrypt</w:t>
             </w:r>
           </w:p>
         </w:tc>
@@ -3036,7 +3059,7 @@
                 <w:sz w:val="20"/>
                 <w:szCs w:val="20"/>
               </w:rPr>
-              <w:t xml:space="preserve">Despliegue continuo de la versión de pruebas</w:t>
+              <w:t xml:space="preserve">Servidor web, proxy inverso y certificado HTTPS en el servidor del centro</w:t>
             </w:r>
           </w:p>
         </w:tc>
@@ -6968,6 +6991,99 @@
     </w:p>
     <w:p>
       <w:pPr>
+        <w:pStyle w:val="ListParagraph"/>
+        <w:numPr>
+          <w:ilvl w:val="0"/>
+          <w:numId w:val="4"/>
+        </w:numPr>
+        <w:spacing w:after="60" w:line="336"/>
+        <w:jc w:val="both"/>
+      </w:pPr>
+      <w:r>
+        <w:rPr>
+          <w:rFonts w:ascii="Times New Roman" w:cs="Times New Roman" w:eastAsia="Times New Roman" w:hAnsi="Times New Roman"/>
+          <w:b/>
+          <w:bCs/>
+          <w:i w:val="false"/>
+          <w:iCs w:val="false"/>
+          <w:sz w:val="24"/>
+          <w:szCs w:val="24"/>
+        </w:rPr>
+        <w:t xml:space="preserve">Noticias:</w:t>
+      </w:r>
+      <w:r>
+        <w:rPr>
+          <w:rFonts w:ascii="Times New Roman" w:cs="Times New Roman" w:eastAsia="Times New Roman" w:hAnsi="Times New Roman"/>
+          <w:sz w:val="24"/>
+          <w:szCs w:val="24"/>
+        </w:rPr>
+        <w:t xml:space="preserve"> destacada y listado con filtros; en el detalle, imágenes con pie de foto dentro del texto, columna lateral fija con opciones para compartir y las noticias más recientes, y noticias relacionadas por tema.</w:t>
+      </w:r>
+    </w:p>
+    <w:p>
+      <w:pPr>
+        <w:pStyle w:val="ListParagraph"/>
+        <w:numPr>
+          <w:ilvl w:val="0"/>
+          <w:numId w:val="4"/>
+        </w:numPr>
+        <w:spacing w:after="60" w:line="336"/>
+        <w:jc w:val="both"/>
+      </w:pPr>
+      <w:r>
+        <w:rPr>
+          <w:rFonts w:ascii="Times New Roman" w:cs="Times New Roman" w:eastAsia="Times New Roman" w:hAnsi="Times New Roman"/>
+          <w:b/>
+          <w:bCs/>
+          <w:i w:val="false"/>
+          <w:iCs w:val="false"/>
+          <w:sz w:val="24"/>
+          <w:szCs w:val="24"/>
+        </w:rPr>
+        <w:t xml:space="preserve">Posicionamiento (SEO):</w:t>
+      </w:r>
+      <w:r>
+        <w:rPr>
+          <w:rFonts w:ascii="Times New Roman" w:cs="Times New Roman" w:eastAsia="Times New Roman" w:hAnsi="Times New Roman"/>
+          <w:sz w:val="24"/>
+          <w:szCs w:val="24"/>
+        </w:rPr>
+        <w:t xml:space="preserve"> título, descripción y dirección canónica en cada página, vista previa para redes sociales, datos estructurados Schema.org del centro, las noticias y los proyectos, y mapas del sitio generados desde la base de datos.</w:t>
+      </w:r>
+    </w:p>
+    <w:p>
+      <w:pPr>
+        <w:pStyle w:val="ListParagraph"/>
+        <w:numPr>
+          <w:ilvl w:val="0"/>
+          <w:numId w:val="4"/>
+        </w:numPr>
+        <w:spacing w:after="60" w:line="336"/>
+        <w:jc w:val="both"/>
+      </w:pPr>
+      <w:r>
+        <w:rPr>
+          <w:rFonts w:ascii="Times New Roman" w:cs="Times New Roman" w:eastAsia="Times New Roman" w:hAnsi="Times New Roman"/>
+          <w:b/>
+          <w:bCs/>
+          <w:i w:val="false"/>
+          <w:iCs w:val="false"/>
+          <w:sz w:val="24"/>
+          <w:szCs w:val="24"/>
+        </w:rPr>
+        <w:t xml:space="preserve">Panel:</w:t>
+      </w:r>
+      <w:r>
+        <w:rPr>
+          <w:rFonts w:ascii="Times New Roman" w:cs="Times New Roman" w:eastAsia="Times New Roman" w:hAnsi="Times New Roman"/>
+          <w:sz w:val="24"/>
+          <w:szCs w:val="24"/>
+        </w:rPr>
+        <w:t xml:space="preserve"> el texto y la foto del encabezado de cada sección se editan desde el panel, sin modificar el código.</w:t>
+      </w:r>
+    </w:p>
+    <w:p>
+      <w:pPr>
         <w:pStyle w:val="Heading2"/>
         <w:keepNext/>
         <w:spacing w:after="120" w:before="240"/>
@@ -7216,7 +7332,22 @@
           <w:sz w:val="24"/>
           <w:szCs w:val="24"/>
         </w:rPr>
-        <w:t xml:space="preserve">La versión de pruebas se despliega de forma continua en Vercel: cada cambio enviado a la rama principal de GitHub dispara la compilación, que aplica las migraciones pendientes en la base de datos PostgreSQL de Neon antes de construir el sitio (Figura 6). La versión definitiva se prevé alojar en los servidores del propio centro, junto a su servidor de correo; la aplicación no depende de servicios exclusivos de Vercel, por lo que basta con una base de datos PostgreSQL, las variables de entorno y un proxy inverso con HTTPS.</w:t>
+        <w:t xml:space="preserve">La versión definitiva se despliega en un servidor propio del centro: un contenedor Linux (LXC, Debian 12) dedicado en la infraestructura de virtualización Proxmox del CEAC y publicado en https://www.ceac.cu. Nginx atiende las peticiones por HTTPS, con un certificado de Let's Encrypt de renovación automática, y las reenvía a la aplicación Next.js, que se ejecuta como servicio del sistema y solo escucha dentro del contenedor; la base de datos PostgreSQL también es local (Figura 6).</w:t>
+      </w:r>
+    </w:p>
+    <w:p>
+      <w:pPr>
+        <w:spacing w:after="120" w:line="360"/>
+        <w:ind w:firstLine="567"/>
+        <w:jc w:val="both"/>
+      </w:pPr>
+      <w:r>
+        <w:rPr>
+          <w:rFonts w:ascii="Times New Roman" w:cs="Times New Roman" w:eastAsia="Times New Roman" w:hAnsi="Times New Roman"/>
+          <w:sz w:val="24"/>
+          <w:szCs w:val="24"/>
+        </w:rPr>
+        <w:t xml:space="preserve">Cada cambio enviado a la rama principal de GitHub se comprueba con GitHub Actions y, si no hay errores, lo despliega un runner instalado en el propio servidor. El runner se conecta hacia fuera a GitHub, por lo que no hace falta abrir puertos de entrada. El script de despliegue copia la base de datos, descarga el código con una clave de solo lectura, instala las dependencias fijadas, aplica las migraciones pendientes, compila y reinicia el servicio. La versión de pruebas inicial se alojó en Vercel con la base de datos en Neon; su contenido se trasladó al servidor del centro con pg_dump y pg_restore.</w:t>
       </w:r>
     </w:p>
     <w:p>
@@ -7279,17 +7410,7 @@
           <w:sz w:val="20"/>
           <w:szCs w:val="20"/>
         </w:rPr>
-        <w:t xml:space="preserve">Figura 6. </w:t>
-      </w:r>
-      <w:r>
-        <w:rPr>
-          <w:rFonts w:ascii="Times New Roman" w:cs="Times New Roman" w:eastAsia="Times New Roman" w:hAnsi="Times New Roman"/>
-          <w:i/>
-          <w:iCs/>
-          <w:sz w:val="20"/>
-          <w:szCs w:val="20"/>
-        </w:rPr>
-        <w:t xml:space="preserve">Entornos de desarrollo y despliegue.</w:t>
+        <w:t xml:space="preserve">Figura 6. Entornos de desarrollo y de producción en el servidor del centro.</w:t>
       </w:r>
     </w:p>
     <w:p>
@@ -7298,7 +7419,8 @@
         <w:keepNext/>
         <w:spacing w:after="120" w:before="240"/>
       </w:pPr>
-      <w:bookmarkStart w:name="_Toc25" w:id="25"/>
+      <w:bookmarkStart w:id="9001" w:name="_Toc90"/>
+      <w:bookmarkEnd w:id="9001"/>
       <w:r>
         <w:rPr>
           <w:rFonts w:ascii="Times New Roman" w:cs="Times New Roman" w:eastAsia="Times New Roman" w:hAnsi="Times New Roman"/>
@@ -7308,9 +7430,23 @@
           <w:sz w:val="26"/>
           <w:szCs w:val="26"/>
         </w:rPr>
-        <w:t xml:space="preserve">3.7 Verificación y validación</w:t>
-      </w:r>
-      <w:bookmarkEnd w:id="25"/>
+        <w:t xml:space="preserve">3.7 Seguridad</w:t>
+      </w:r>
+    </w:p>
+    <w:p>
+      <w:pPr>
+        <w:spacing w:after="120" w:line="360"/>
+        <w:ind w:firstLine="567"/>
+        <w:jc w:val="both"/>
+      </w:pPr>
+      <w:r>
+        <w:rPr>
+          <w:rFonts w:ascii="Times New Roman" w:cs="Times New Roman" w:eastAsia="Times New Roman" w:hAnsi="Times New Roman"/>
+          <w:sz w:val="24"/>
+          <w:szCs w:val="24"/>
+        </w:rPr>
+        <w:t xml:space="preserve">La seguridad se abordó en varias capas, en coherencia con las exigencias de los órganos de control:</w:t>
+      </w:r>
     </w:p>
     <w:p>
       <w:pPr>
@@ -7332,15 +7468,15 @@
           <w:sz w:val="24"/>
           <w:szCs w:val="24"/>
         </w:rPr>
-        <w:t xml:space="preserve">Validación de tipos:</w:t>
-      </w:r>
-      <w:r>
-        <w:rPr>
-          <w:rFonts w:ascii="Times New Roman" w:cs="Times New Roman" w:eastAsia="Times New Roman" w:hAnsi="Times New Roman"/>
-          <w:sz w:val="24"/>
-          <w:szCs w:val="24"/>
-        </w:rPr>
-        <w:t xml:space="preserve"> cada cambio se comprobó con el compilador de TypeScript antes de integrarse.</w:t>
+        <w:t xml:space="preserve">Red:</w:t>
+      </w:r>
+      <w:r>
+        <w:rPr>
+          <w:rFonts w:ascii="Times New Roman" w:cs="Times New Roman" w:eastAsia="Times New Roman" w:hAnsi="Times New Roman"/>
+          <w:sz w:val="24"/>
+          <w:szCs w:val="24"/>
+        </w:rPr>
+        <w:t xml:space="preserve"> solo se publican los puertos 80 y 443, hacia un contenedor dedicado, a través del cortafuegos perimetral y del interno.</w:t>
       </w:r>
     </w:p>
     <w:p>
@@ -7363,15 +7499,15 @@
           <w:sz w:val="24"/>
           <w:szCs w:val="24"/>
         </w:rPr>
-        <w:t xml:space="preserve">Verificación visual automatizada:</w:t>
-      </w:r>
-      <w:r>
-        <w:rPr>
-          <w:rFonts w:ascii="Times New Roman" w:cs="Times New Roman" w:eastAsia="Times New Roman" w:hAnsi="Times New Roman"/>
-          <w:sz w:val="24"/>
-          <w:szCs w:val="24"/>
-        </w:rPr>
-        <w:t xml:space="preserve"> con Puppeteer se recorrieron las páginas en distintos tamaños de pantalla (390, 820, 1024, 1366, 1440 y 1920 píxeles de ancho) para detectar desbordes horizontales y revisar el aspecto de cada sección.</w:t>
+        <w:t xml:space="preserve">Panel de administración:</w:t>
+      </w:r>
+      <w:r>
+        <w:rPr>
+          <w:rFonts w:ascii="Times New Roman" w:cs="Times New Roman" w:eastAsia="Times New Roman" w:hAnsi="Times New Roman"/>
+          <w:sz w:val="24"/>
+          <w:szCs w:val="24"/>
+        </w:rPr>
+        <w:t xml:space="preserve"> accesible, igual que la API, solo desde la red del centro, con restricción por dirección IP en Nginx y en la propia aplicación.</w:t>
       </w:r>
     </w:p>
     <w:p>
@@ -7394,15 +7530,15 @@
           <w:sz w:val="24"/>
           <w:szCs w:val="24"/>
         </w:rPr>
-        <w:t xml:space="preserve">Pruebas funcionales:</w:t>
-      </w:r>
-      <w:r>
-        <w:rPr>
-          <w:rFonts w:ascii="Times New Roman" w:cs="Times New Roman" w:eastAsia="Times New Roman" w:hAnsi="Times New Roman"/>
-          <w:sz w:val="24"/>
-          <w:szCs w:val="24"/>
-        </w:rPr>
-        <w:t xml:space="preserve"> se probaron casos concretos, como enviar un teléfono con letras al servidor (rechazado), arrastrar las cintas animadas, cambiar de mes en Docencia o subir y recortar imágenes en Cloudinary.</w:t>
+        <w:t xml:space="preserve">Autenticación:</w:t>
+      </w:r>
+      <w:r>
+        <w:rPr>
+          <w:rFonts w:ascii="Times New Roman" w:cs="Times New Roman" w:eastAsia="Times New Roman" w:hAnsi="Times New Roman"/>
+          <w:sz w:val="24"/>
+          <w:szCs w:val="24"/>
+        </w:rPr>
+        <w:t xml:space="preserve"> contraseñas cifradas con PBKDF2-SHA256 y sal, bloqueo de 15 minutos tras cinco intentos fallidos y sesiones de cuatro horas con cookies HttpOnly que solo viajan por HTTPS.</w:t>
       </w:r>
     </w:p>
     <w:p>
@@ -7425,15 +7561,92 @@
           <w:sz w:val="24"/>
           <w:szCs w:val="24"/>
         </w:rPr>
-        <w:t xml:space="preserve">Validación con el cliente:</w:t>
-      </w:r>
-      <w:r>
-        <w:rPr>
-          <w:rFonts w:ascii="Times New Roman" w:cs="Times New Roman" w:eastAsia="Times New Roman" w:hAnsi="Times New Roman"/>
-          <w:sz w:val="24"/>
-          <w:szCs w:val="24"/>
-        </w:rPr>
-        <w:t xml:space="preserve"> cada página fue revisada por el centro, y sus observaciones dieron lugar a nuevas iteraciones de diseño o de implementación.</w:t>
+        <w:t xml:space="preserve">Protección de datos:</w:t>
+      </w:r>
+      <w:r>
+        <w:rPr>
+          <w:rFonts w:ascii="Times New Roman" w:cs="Times New Roman" w:eastAsia="Times New Roman" w:hAnsi="Times New Roman"/>
+          <w:sz w:val="24"/>
+          <w:szCs w:val="24"/>
+        </w:rPr>
+        <w:t xml:space="preserve"> los correos del centro y de los investigadores no se exponen en el sitio ni en la API; el formulario exige consentimiento y se valida en el servidor.</w:t>
+      </w:r>
+    </w:p>
+    <w:p>
+      <w:pPr>
+        <w:pStyle w:val="ListParagraph"/>
+        <w:numPr>
+          <w:ilvl w:val="0"/>
+          <w:numId w:val="4"/>
+        </w:numPr>
+        <w:spacing w:after="60" w:line="336"/>
+        <w:jc w:val="both"/>
+      </w:pPr>
+      <w:r>
+        <w:rPr>
+          <w:rFonts w:ascii="Times New Roman" w:cs="Times New Roman" w:eastAsia="Times New Roman" w:hAnsi="Times New Roman"/>
+          <w:b/>
+          <w:bCs/>
+          <w:i w:val="false"/>
+          <w:iCs w:val="false"/>
+          <w:sz w:val="24"/>
+          <w:szCs w:val="24"/>
+        </w:rPr>
+        <w:t xml:space="preserve">Transporte:</w:t>
+      </w:r>
+      <w:r>
+        <w:rPr>
+          <w:rFonts w:ascii="Times New Roman" w:cs="Times New Roman" w:eastAsia="Times New Roman" w:hAnsi="Times New Roman"/>
+          <w:sz w:val="24"/>
+          <w:szCs w:val="24"/>
+        </w:rPr>
+        <w:t xml:space="preserve"> HTTPS obligatorio con HSTS y cabeceras de seguridad (nosniff, X-Frame-Options, Referrer-Policy y Permissions-Policy).</w:t>
+      </w:r>
+    </w:p>
+    <w:p>
+      <w:pPr>
+        <w:pStyle w:val="ListParagraph"/>
+        <w:numPr>
+          <w:ilvl w:val="0"/>
+          <w:numId w:val="4"/>
+        </w:numPr>
+        <w:spacing w:after="60" w:line="336"/>
+        <w:jc w:val="both"/>
+      </w:pPr>
+      <w:r>
+        <w:rPr>
+          <w:rFonts w:ascii="Times New Roman" w:cs="Times New Roman" w:eastAsia="Times New Roman" w:hAnsi="Times New Roman"/>
+          <w:b/>
+          <w:bCs/>
+          <w:i w:val="false"/>
+          <w:iCs w:val="false"/>
+          <w:sz w:val="24"/>
+          <w:szCs w:val="24"/>
+        </w:rPr>
+        <w:t xml:space="preserve">Continuidad:</w:t>
+      </w:r>
+      <w:r>
+        <w:rPr>
+          <w:rFonts w:ascii="Times New Roman" w:cs="Times New Roman" w:eastAsia="Times New Roman" w:hAnsi="Times New Roman"/>
+          <w:sz w:val="24"/>
+          <w:szCs w:val="24"/>
+        </w:rPr>
+        <w:t xml:space="preserve"> copia diaria de la base de datos, copia previa a cada despliegue y copias del contenedor completo en Proxmox.</w:t>
+      </w:r>
+    </w:p>
+    <w:p>
+      <w:pPr>
+        <w:spacing w:after="120" w:line="360"/>
+        <w:ind w:firstLine="567"/>
+        <w:jc w:val="both"/>
+      </w:pPr>
+      <w:r>
+        <w:rPr>
+          <w:rFonts w:ascii="Times New Roman" w:cs="Times New Roman" w:eastAsia="Times New Roman" w:hAnsi="Times New Roman"/>
+          <w:sz w:val="24"/>
+          <w:szCs w:val="24"/>
+        </w:rPr>
+        <w:t xml:space="preserve">Las medidas, los procedimientos de operación y el plan de mejora se recogen en el documento «Seguridad del sitio web del CEAC», preparado para la dirección del centro y los órganos de control.</w:t>
       </w:r>
     </w:p>
     <w:p>
@@ -7442,7 +7655,8 @@
         <w:keepNext/>
         <w:spacing w:after="120" w:before="240"/>
       </w:pPr>
-      <w:bookmarkStart w:name="_Toc26" w:id="26"/>
+      <w:bookmarkStart w:name="_Toc25" w:id="25"/>
+      <w:bookmarkEnd w:id="25"/>
       <w:r>
         <w:rPr>
           <w:rFonts w:ascii="Times New Roman" w:cs="Times New Roman" w:eastAsia="Times New Roman" w:hAnsi="Times New Roman"/>
@@ -7452,9 +7666,152 @@
           <w:sz w:val="26"/>
           <w:szCs w:val="26"/>
         </w:rPr>
-        <w:t xml:space="preserve">3.8 Resultados</w:t>
-      </w:r>
+        <w:t xml:space="preserve">3.8 Verificación y validación</w:t>
+      </w:r>
+    </w:p>
+    <w:p>
+      <w:pPr>
+        <w:pStyle w:val="ListParagraph"/>
+        <w:numPr>
+          <w:ilvl w:val="0"/>
+          <w:numId w:val="4"/>
+        </w:numPr>
+        <w:spacing w:after="60" w:line="336"/>
+        <w:jc w:val="both"/>
+      </w:pPr>
+      <w:r>
+        <w:rPr>
+          <w:rFonts w:ascii="Times New Roman" w:cs="Times New Roman" w:eastAsia="Times New Roman" w:hAnsi="Times New Roman"/>
+          <w:b/>
+          <w:bCs/>
+          <w:i w:val="false"/>
+          <w:iCs w:val="false"/>
+          <w:sz w:val="24"/>
+          <w:szCs w:val="24"/>
+        </w:rPr>
+        <w:t xml:space="preserve">Validación de tipos:</w:t>
+      </w:r>
+      <w:r>
+        <w:rPr>
+          <w:rFonts w:ascii="Times New Roman" w:cs="Times New Roman" w:eastAsia="Times New Roman" w:hAnsi="Times New Roman"/>
+          <w:sz w:val="24"/>
+          <w:szCs w:val="24"/>
+        </w:rPr>
+        <w:t xml:space="preserve"> cada cambio se comprobó con el compilador de TypeScript antes de integrarse.</w:t>
+      </w:r>
+    </w:p>
+    <w:p>
+      <w:pPr>
+        <w:pStyle w:val="ListParagraph"/>
+        <w:numPr>
+          <w:ilvl w:val="0"/>
+          <w:numId w:val="4"/>
+        </w:numPr>
+        <w:spacing w:after="60" w:line="336"/>
+        <w:jc w:val="both"/>
+      </w:pPr>
+      <w:r>
+        <w:rPr>
+          <w:rFonts w:ascii="Times New Roman" w:cs="Times New Roman" w:eastAsia="Times New Roman" w:hAnsi="Times New Roman"/>
+          <w:b/>
+          <w:bCs/>
+          <w:i w:val="false"/>
+          <w:iCs w:val="false"/>
+          <w:sz w:val="24"/>
+          <w:szCs w:val="24"/>
+        </w:rPr>
+        <w:t xml:space="preserve">Verificación visual automatizada:</w:t>
+      </w:r>
+      <w:r>
+        <w:rPr>
+          <w:rFonts w:ascii="Times New Roman" w:cs="Times New Roman" w:eastAsia="Times New Roman" w:hAnsi="Times New Roman"/>
+          <w:sz w:val="24"/>
+          <w:szCs w:val="24"/>
+        </w:rPr>
+        <w:t xml:space="preserve"> con Puppeteer se recorrieron las páginas en distintos tamaños de pantalla (390, 820, 1024, 1366, 1440 y 1920 píxeles de ancho) para detectar desbordes horizontales y revisar el aspecto de cada sección.</w:t>
+      </w:r>
+    </w:p>
+    <w:p>
+      <w:pPr>
+        <w:pStyle w:val="ListParagraph"/>
+        <w:numPr>
+          <w:ilvl w:val="0"/>
+          <w:numId w:val="4"/>
+        </w:numPr>
+        <w:spacing w:after="60" w:line="336"/>
+        <w:jc w:val="both"/>
+      </w:pPr>
+      <w:r>
+        <w:rPr>
+          <w:rFonts w:ascii="Times New Roman" w:cs="Times New Roman" w:eastAsia="Times New Roman" w:hAnsi="Times New Roman"/>
+          <w:b/>
+          <w:bCs/>
+          <w:i w:val="false"/>
+          <w:iCs w:val="false"/>
+          <w:sz w:val="24"/>
+          <w:szCs w:val="24"/>
+        </w:rPr>
+        <w:t xml:space="preserve">Pruebas funcionales:</w:t>
+      </w:r>
+      <w:r>
+        <w:rPr>
+          <w:rFonts w:ascii="Times New Roman" w:cs="Times New Roman" w:eastAsia="Times New Roman" w:hAnsi="Times New Roman"/>
+          <w:sz w:val="24"/>
+          <w:szCs w:val="24"/>
+        </w:rPr>
+        <w:t xml:space="preserve"> se probaron casos concretos, como enviar un teléfono con letras al servidor (rechazado), arrastrar las cintas animadas, cambiar de mes en Docencia o subir y recortar imágenes en Cloudinary.</w:t>
+      </w:r>
+    </w:p>
+    <w:p>
+      <w:pPr>
+        <w:pStyle w:val="ListParagraph"/>
+        <w:numPr>
+          <w:ilvl w:val="0"/>
+          <w:numId w:val="4"/>
+        </w:numPr>
+        <w:spacing w:after="60" w:line="336"/>
+        <w:jc w:val="both"/>
+      </w:pPr>
+      <w:r>
+        <w:rPr>
+          <w:rFonts w:ascii="Times New Roman" w:cs="Times New Roman" w:eastAsia="Times New Roman" w:hAnsi="Times New Roman"/>
+          <w:b/>
+          <w:bCs/>
+          <w:i w:val="false"/>
+          <w:iCs w:val="false"/>
+          <w:sz w:val="24"/>
+          <w:szCs w:val="24"/>
+        </w:rPr>
+        <w:t xml:space="preserve">Validación con el cliente:</w:t>
+      </w:r>
+      <w:r>
+        <w:rPr>
+          <w:rFonts w:ascii="Times New Roman" w:cs="Times New Roman" w:eastAsia="Times New Roman" w:hAnsi="Times New Roman"/>
+          <w:sz w:val="24"/>
+          <w:szCs w:val="24"/>
+        </w:rPr>
+        <w:t xml:space="preserve"> cada página fue revisada por el centro, y sus observaciones dieron lugar a nuevas iteraciones de diseño o de implementación.</w:t>
+      </w:r>
+    </w:p>
+    <w:p>
+      <w:pPr>
+        <w:pStyle w:val="Heading2"/>
+        <w:keepNext/>
+        <w:spacing w:after="120" w:before="240"/>
+      </w:pPr>
+      <w:bookmarkStart w:name="_Toc26" w:id="26"/>
       <w:bookmarkEnd w:id="26"/>
+      <w:r>
+        <w:rPr>
+          <w:rFonts w:ascii="Times New Roman" w:cs="Times New Roman" w:eastAsia="Times New Roman" w:hAnsi="Times New Roman"/>
+          <w:b/>
+          <w:bCs/>
+          <w:color w:val="083B66"/>
+          <w:sz w:val="26"/>
+          <w:szCs w:val="26"/>
+        </w:rPr>
+        <w:t xml:space="preserve">3.9 Resultados</w:t>
+      </w:r>
     </w:p>
     <w:p>
       <w:pPr>
@@ -7679,7 +8036,7 @@
                 <w:sz w:val="20"/>
                 <w:szCs w:val="20"/>
               </w:rPr>
-              <w:t xml:space="preserve">164</w:t>
+              <w:t xml:space="preserve">178</w:t>
             </w:r>
           </w:p>
         </w:tc>
@@ -7856,7 +8213,7 @@
                 <w:sz w:val="20"/>
                 <w:szCs w:val="20"/>
               </w:rPr>
-              <w:t xml:space="preserve">13 / 4</w:t>
+              <w:t xml:space="preserve">12 / 5</w:t>
             </w:r>
           </w:p>
         </w:tc>
@@ -7915,7 +8272,7 @@
                 <w:sz w:val="20"/>
                 <w:szCs w:val="20"/>
               </w:rPr>
-              <w:t xml:space="preserve">7</w:t>
+              <w:t xml:space="preserve">9</w:t>
             </w:r>
           </w:p>
         </w:tc>
@@ -7974,7 +8331,7 @@
                 <w:sz w:val="20"/>
                 <w:szCs w:val="20"/>
               </w:rPr>
-              <w:t xml:space="preserve">30 páginas con 24 capturas del panel</w:t>
+              <w:t xml:space="preserve">30 páginas con 24 capturas, más un complemento de novedades</w:t>
             </w:r>
           </w:p>
         </w:tc>
@@ -8097,6 +8454,25 @@
           <w:sz w:val="24"/>
           <w:szCs w:val="24"/>
         </w:rPr>
+        <w:t xml:space="preserve">El sitio se desplegó en un servidor propio del centro y se publicó en www.ceac.cu con HTTPS, panel restringido a la red interna, copias de seguridad diarias y despliegue automático desde el control de versiones, con sus medidas de seguridad documentadas.</w:t>
+      </w:r>
+    </w:p>
+    <w:p>
+      <w:pPr>
+        <w:pStyle w:val="ListParagraph"/>
+        <w:numPr>
+          <w:ilvl w:val="0"/>
+          <w:numId w:val="5"/>
+        </w:numPr>
+        <w:spacing w:after="60" w:line="336"/>
+        <w:jc w:val="both"/>
+      </w:pPr>
+      <w:r>
+        <w:rPr>
+          <w:rFonts w:ascii="Times New Roman" w:cs="Times New Roman" w:eastAsia="Times New Roman" w:hAnsi="Times New Roman"/>
+          <w:sz w:val="24"/>
+          <w:szCs w:val="24"/>
+        </w:rPr>
         <w:t xml:space="preserve">La primera versión cumple los objetivos planteados y queda documentada con un manual de usuario para los editores y un README técnico para su mantenimiento.</w:t>
       </w:r>
     </w:p>
@@ -8136,7 +8512,7 @@
           <w:sz w:val="24"/>
           <w:szCs w:val="24"/>
         </w:rPr>
-        <w:t xml:space="preserve">Configurar el adaptador de correo (SMTP) con el servidor de correo del centro para que los avisos del formulario lleguen a sus destinatarios.</w:t>
+        <w:t xml:space="preserve">Conectar el adaptador de correo, ya incorporado al sitio, con el servidor de correo del centro para que los avisos del formulario lleguen a sus destinatarios.</w:t>
       </w:r>
     </w:p>
     <w:p>
@@ -8155,7 +8531,26 @@
           <w:sz w:val="24"/>
           <w:szCs w:val="24"/>
         </w:rPr>
-        <w:t xml:space="preserve">Desplegar la versión definitiva en los servidores del CEAC y configurar copias de seguridad periódicas de la base de datos y de las imágenes.</w:t>
+        <w:t xml:space="preserve">Completar el plan de mejora de seguridad: acceso remoto al panel solo por VPN, cierre de los accesos de administración expuestos en el cortafuegos perimetral y traslado de las imágenes al servidor del centro.</w:t>
+      </w:r>
+    </w:p>
+    <w:p>
+      <w:pPr>
+        <w:pStyle w:val="ListParagraph"/>
+        <w:numPr>
+          <w:ilvl w:val="0"/>
+          <w:numId w:val="4"/>
+        </w:numPr>
+        <w:spacing w:after="60" w:line="336"/>
+        <w:jc w:val="both"/>
+      </w:pPr>
+      <w:r>
+        <w:rPr>
+          <w:rFonts w:ascii="Times New Roman" w:cs="Times New Roman" w:eastAsia="Times New Roman" w:hAnsi="Times New Roman"/>
+          <w:sz w:val="24"/>
+          <w:szCs w:val="24"/>
+        </w:rPr>
+        <w:t xml:space="preserve">Registrar el sitio en Google Search Console y Bing, y redirigir las direcciones más visitadas de la web anterior a las nuevas.</w:t>
       </w:r>
     </w:p>
     <w:p>
@@ -8824,6 +9219,321 @@
     </w:p>
     <w:p>
       <w:pPr>
+        <w:keepNext/>
+        <w:spacing w:after="60" w:before="120"/>
+        <w:jc w:val="center"/>
+      </w:pPr>
+      <w:r>
+        <w:drawing>
+          <wp:inline distT="0" distB="0" distL="0" distR="0">
+            <wp:extent cx="5580698" cy="6355794"/>
+            <wp:effectExtent t="0" r="0" b="0" l="0"/>
+            <wp:docPr id="200" name="" descr="" title=""/>
+            <wp:cNvGraphicFramePr>
+              <a:graphicFrameLocks xmlns:a="http://schemas.openxmlformats.org/drawingml/2006/main" noChangeAspect="1"/>
+            </wp:cNvGraphicFramePr>
+            <a:graphic xmlns:a="http://schemas.openxmlformats.org/drawingml/2006/main">
+              <a:graphicData uri="http://schemas.openxmlformats.org/drawingml/2006/picture">
+                <pic:pic xmlns:pic="http://schemas.openxmlformats.org/drawingml/2006/picture">
+                  <pic:nvPicPr>
+                    <pic:cNvPr id="200" name="" descr=""/>
+                    <pic:cNvPicPr>
+                      <a:picLocks noChangeAspect="1" noChangeArrowheads="1"/>
+                    </pic:cNvPicPr>
+                  </pic:nvPicPr>
+                  <pic:blipFill>
+                    <a:blip r:embed="rId200" cstate="none"/>
+                    <a:srcRect/>
+                    <a:stretch>
+                      <a:fillRect/>
+                    </a:stretch>
+                  </pic:blipFill>
+                  <pic:spPr bwMode="auto">
+                    <a:xfrm>
+                      <a:off x="0" y="0"/>
+                      <a:ext cx="5580698" cy="6355794"/>
+                    </a:xfrm>
+                    <a:prstGeom prst="rect">
+                      <a:avLst/>
+                    </a:prstGeom>
+                  </pic:spPr>
+                </pic:pic>
+              </a:graphicData>
+            </a:graphic>
+          </wp:inline>
+        </w:drawing>
+      </w:r>
+    </w:p>
+    <w:p>
+      <w:pPr>
+        <w:spacing w:after="200"/>
+        <w:jc w:val="center"/>
+      </w:pPr>
+      <w:r>
+        <w:rPr>
+          <w:rFonts w:ascii="Times New Roman" w:cs="Times New Roman" w:eastAsia="Times New Roman" w:hAnsi="Times New Roman"/>
+          <w:b/>
+          <w:bCs/>
+          <w:sz w:val="20"/>
+          <w:szCs w:val="20"/>
+        </w:rPr>
+        <w:t xml:space="preserve">Figura 8. Página de Investigación: mapa de líneas e investigadores.</w:t>
+      </w:r>
+    </w:p>
+    <w:p>
+      <w:pPr>
+        <w:keepNext/>
+        <w:spacing w:after="60" w:before="120"/>
+        <w:jc w:val="center"/>
+      </w:pPr>
+      <w:r>
+        <w:drawing>
+          <wp:inline distT="0" distB="0" distL="0" distR="0">
+            <wp:extent cx="5580698" cy="6045756"/>
+            <wp:effectExtent t="0" r="0" b="0" l="0"/>
+            <wp:docPr id="201" name="" descr="" title=""/>
+            <wp:cNvGraphicFramePr>
+              <a:graphicFrameLocks xmlns:a="http://schemas.openxmlformats.org/drawingml/2006/main" noChangeAspect="1"/>
+            </wp:cNvGraphicFramePr>
+            <a:graphic xmlns:a="http://schemas.openxmlformats.org/drawingml/2006/main">
+              <a:graphicData uri="http://schemas.openxmlformats.org/drawingml/2006/picture">
+                <pic:pic xmlns:pic="http://schemas.openxmlformats.org/drawingml/2006/picture">
+                  <pic:nvPicPr>
+                    <pic:cNvPr id="201" name="" descr=""/>
+                    <pic:cNvPicPr>
+                      <a:picLocks noChangeAspect="1" noChangeArrowheads="1"/>
+                    </pic:cNvPicPr>
+                  </pic:nvPicPr>
+                  <pic:blipFill>
+                    <a:blip r:embed="rId201" cstate="none"/>
+                    <a:srcRect/>
+                    <a:stretch>
+                      <a:fillRect/>
+                    </a:stretch>
+                  </pic:blipFill>
+                  <pic:spPr bwMode="auto">
+                    <a:xfrm>
+                      <a:off x="0" y="0"/>
+                      <a:ext cx="5580698" cy="6045756"/>
+                    </a:xfrm>
+                    <a:prstGeom prst="rect">
+                      <a:avLst/>
+                    </a:prstGeom>
+                  </pic:spPr>
+                </pic:pic>
+              </a:graphicData>
+            </a:graphic>
+          </wp:inline>
+        </w:drawing>
+      </w:r>
+    </w:p>
+    <w:p>
+      <w:pPr>
+        <w:spacing w:after="200"/>
+        <w:jc w:val="center"/>
+      </w:pPr>
+      <w:r>
+        <w:rPr>
+          <w:rFonts w:ascii="Times New Roman" w:cs="Times New Roman" w:eastAsia="Times New Roman" w:hAnsi="Times New Roman"/>
+          <w:b/>
+          <w:bCs/>
+          <w:sz w:val="20"/>
+          <w:szCs w:val="20"/>
+        </w:rPr>
+        <w:t xml:space="preserve">Figura 9. Página de Docencia: autorización y oferta del año por meses.</w:t>
+      </w:r>
+    </w:p>
+    <w:p>
+      <w:pPr>
+        <w:keepNext/>
+        <w:spacing w:after="60" w:before="120"/>
+        <w:jc w:val="center"/>
+      </w:pPr>
+      <w:r>
+        <w:drawing>
+          <wp:inline distT="0" distB="0" distL="0" distR="0">
+            <wp:extent cx="5580698" cy="5813227"/>
+            <wp:effectExtent t="0" r="0" b="0" l="0"/>
+            <wp:docPr id="202" name="" descr="" title=""/>
+            <wp:cNvGraphicFramePr>
+              <a:graphicFrameLocks xmlns:a="http://schemas.openxmlformats.org/drawingml/2006/main" noChangeAspect="1"/>
+            </wp:cNvGraphicFramePr>
+            <a:graphic xmlns:a="http://schemas.openxmlformats.org/drawingml/2006/main">
+              <a:graphicData uri="http://schemas.openxmlformats.org/drawingml/2006/picture">
+                <pic:pic xmlns:pic="http://schemas.openxmlformats.org/drawingml/2006/picture">
+                  <pic:nvPicPr>
+                    <pic:cNvPr id="202" name="" descr=""/>
+                    <pic:cNvPicPr>
+                      <a:picLocks noChangeAspect="1" noChangeArrowheads="1"/>
+                    </pic:cNvPicPr>
+                  </pic:nvPicPr>
+                  <pic:blipFill>
+                    <a:blip r:embed="rId202" cstate="none"/>
+                    <a:srcRect/>
+                    <a:stretch>
+                      <a:fillRect/>
+                    </a:stretch>
+                  </pic:blipFill>
+                  <pic:spPr bwMode="auto">
+                    <a:xfrm>
+                      <a:off x="0" y="0"/>
+                      <a:ext cx="5580698" cy="5813227"/>
+                    </a:xfrm>
+                    <a:prstGeom prst="rect">
+                      <a:avLst/>
+                    </a:prstGeom>
+                  </pic:spPr>
+                </pic:pic>
+              </a:graphicData>
+            </a:graphic>
+          </wp:inline>
+        </w:drawing>
+      </w:r>
+    </w:p>
+    <w:p>
+      <w:pPr>
+        <w:spacing w:after="200"/>
+        <w:jc w:val="center"/>
+      </w:pPr>
+      <w:r>
+        <w:rPr>
+          <w:rFonts w:ascii="Times New Roman" w:cs="Times New Roman" w:eastAsia="Times New Roman" w:hAnsi="Times New Roman"/>
+          <w:b/>
+          <w:bCs/>
+          <w:sz w:val="20"/>
+          <w:szCs w:val="20"/>
+        </w:rPr>
+        <w:t xml:space="preserve">Figura 10. Detalle de noticia con columna lateral de compartir y noticias recientes.</w:t>
+      </w:r>
+    </w:p>
+    <w:p>
+      <w:pPr>
+        <w:keepNext/>
+        <w:spacing w:after="60" w:before="120"/>
+        <w:jc w:val="center"/>
+      </w:pPr>
+      <w:r>
+        <w:drawing>
+          <wp:inline distT="0" distB="0" distL="0" distR="0">
+            <wp:extent cx="2300000" cy="4600000"/>
+            <wp:effectExtent t="0" r="0" b="0" l="0"/>
+            <wp:docPr id="203" name="" descr="" title=""/>
+            <wp:cNvGraphicFramePr>
+              <a:graphicFrameLocks xmlns:a="http://schemas.openxmlformats.org/drawingml/2006/main" noChangeAspect="1"/>
+            </wp:cNvGraphicFramePr>
+            <a:graphic xmlns:a="http://schemas.openxmlformats.org/drawingml/2006/main">
+              <a:graphicData uri="http://schemas.openxmlformats.org/drawingml/2006/picture">
+                <pic:pic xmlns:pic="http://schemas.openxmlformats.org/drawingml/2006/picture">
+                  <pic:nvPicPr>
+                    <pic:cNvPr id="203" name="" descr=""/>
+                    <pic:cNvPicPr>
+                      <a:picLocks noChangeAspect="1" noChangeArrowheads="1"/>
+                    </pic:cNvPicPr>
+                  </pic:nvPicPr>
+                  <pic:blipFill>
+                    <a:blip r:embed="rId203" cstate="none"/>
+                    <a:srcRect/>
+                    <a:stretch>
+                      <a:fillRect/>
+                    </a:stretch>
+                  </pic:blipFill>
+                  <pic:spPr bwMode="auto">
+                    <a:xfrm>
+                      <a:off x="0" y="0"/>
+                      <a:ext cx="2300000" cy="4600000"/>
+                    </a:xfrm>
+                    <a:prstGeom prst="rect">
+                      <a:avLst/>
+                    </a:prstGeom>
+                  </pic:spPr>
+                </pic:pic>
+              </a:graphicData>
+            </a:graphic>
+          </wp:inline>
+        </w:drawing>
+      </w:r>
+    </w:p>
+    <w:p>
+      <w:pPr>
+        <w:spacing w:after="200"/>
+        <w:jc w:val="center"/>
+      </w:pPr>
+      <w:r>
+        <w:rPr>
+          <w:rFonts w:ascii="Times New Roman" w:cs="Times New Roman" w:eastAsia="Times New Roman" w:hAnsi="Times New Roman"/>
+          <w:b/>
+          <w:bCs/>
+          <w:sz w:val="20"/>
+          <w:szCs w:val="20"/>
+        </w:rPr>
+        <w:t xml:space="preserve">Figura 11. Página de inicio en un teléfono móvil.</w:t>
+      </w:r>
+    </w:p>
+    <w:p>
+      <w:pPr>
+        <w:keepNext/>
+        <w:spacing w:after="60" w:before="120"/>
+        <w:jc w:val="center"/>
+      </w:pPr>
+      <w:r>
+        <w:drawing>
+          <wp:inline distT="0" distB="0" distL="0" distR="0">
+            <wp:extent cx="5580698" cy="2170271"/>
+            <wp:effectExtent t="0" r="0" b="0" l="0"/>
+            <wp:docPr id="204" name="" descr="" title=""/>
+            <wp:cNvGraphicFramePr>
+              <a:graphicFrameLocks xmlns:a="http://schemas.openxmlformats.org/drawingml/2006/main" noChangeAspect="1"/>
+            </wp:cNvGraphicFramePr>
+            <a:graphic xmlns:a="http://schemas.openxmlformats.org/drawingml/2006/main">
+              <a:graphicData uri="http://schemas.openxmlformats.org/drawingml/2006/picture">
+                <pic:pic xmlns:pic="http://schemas.openxmlformats.org/drawingml/2006/picture">
+                  <pic:nvPicPr>
+                    <pic:cNvPr id="204" name="" descr=""/>
+                    <pic:cNvPicPr>
+                      <a:picLocks noChangeAspect="1" noChangeArrowheads="1"/>
+                    </pic:cNvPicPr>
+                  </pic:nvPicPr>
+                  <pic:blipFill>
+                    <a:blip r:embed="rId204" cstate="none"/>
+                    <a:srcRect/>
+                    <a:stretch>
+                      <a:fillRect/>
+                    </a:stretch>
+                  </pic:blipFill>
+                  <pic:spPr bwMode="auto">
+                    <a:xfrm>
+                      <a:off x="0" y="0"/>
+                      <a:ext cx="5580698" cy="2170271"/>
+                    </a:xfrm>
+                    <a:prstGeom prst="rect">
+                      <a:avLst/>
+                    </a:prstGeom>
+                  </pic:spPr>
+                </pic:pic>
+              </a:graphicData>
+            </a:graphic>
+          </wp:inline>
+        </w:drawing>
+      </w:r>
+    </w:p>
+    <w:p>
+      <w:pPr>
+        <w:spacing w:after="200"/>
+        <w:jc w:val="center"/>
+      </w:pPr>
+      <w:r>
+        <w:rPr>
+          <w:rFonts w:ascii="Times New Roman" w:cs="Times New Roman" w:eastAsia="Times New Roman" w:hAnsi="Times New Roman"/>
+          <w:b/>
+          <w:bCs/>
+          <w:sz w:val="20"/>
+          <w:szCs w:val="20"/>
+        </w:rPr>
+        <w:t xml:space="preserve">Figura 12. Panel de administración: encabezados de páginas editables.</w:t>
+      </w:r>
+    </w:p>
+    <w:p>
+      <w:pPr>
         <w:pStyle w:val="Heading2"/>
         <w:keepNext/>
         <w:spacing w:after="120" w:before="240"/>
@@ -9233,7 +9943,7 @@
                 <w:sz w:val="20"/>
                 <w:szCs w:val="20"/>
               </w:rPr>
-              <w:t xml:space="preserve">Título, resumen, contenido, foto, categoría, galería, etiquetas, borradores</w:t>
+              <w:t xml:space="preserve">Título, resumen, contenido con imágenes y pie de foto, foto, categoría, galería, etiquetas, SEO y borradores</w:t>
             </w:r>
           </w:p>
         </w:tc>
@@ -10180,6 +10890,92 @@
                 <w:szCs w:val="20"/>
               </w:rPr>
               <w:t xml:space="preserve">Teléfonos, correo, dirección, redes sociales y mapa</w:t>
+            </w:r>
+          </w:p>
+        </w:tc>
+      </w:tr>
+      <w:tr>
+        <w:trPr>
+          <w:cantSplit/>
+        </w:trPr>
+        <w:tc>
+          <w:tcPr>
+            <w:tcW w:type="dxa" w:w="2900"/>
+            <w:tcBorders>
+              <w:top w:val="single" w:color="9FB8CE" w:sz="4"/>
+              <w:left w:val="single" w:color="9FB8CE" w:sz="4"/>
+              <w:bottom w:val="single" w:color="9FB8CE" w:sz="4"/>
+              <w:right w:val="single" w:color="9FB8CE" w:sz="4"/>
+            </w:tcBorders>
+            <w:tcMar>
+              <w:top w:type="dxa" w:w="60"/>
+              <w:left w:type="dxa" w:w="100"/>
+              <w:bottom w:type="dxa" w:w="60"/>
+              <w:right w:type="dxa" w:w="100"/>
+            </w:tcMar>
+          </w:tcPr>
+          <w:p>
+            <w:r>
+              <w:rPr>
+                <w:rFonts w:ascii="Times New Roman" w:cs="Times New Roman" w:eastAsia="Times New Roman" w:hAnsi="Times New Roman"/>
+                <w:sz w:val="20"/>
+                <w:szCs w:val="20"/>
+              </w:rPr>
+              <w:t xml:space="preserve">Encabezados de páginas</w:t>
+            </w:r>
+          </w:p>
+        </w:tc>
+        <w:tc>
+          <w:tcPr>
+            <w:tcW w:type="dxa" w:w="1200"/>
+            <w:tcBorders>
+              <w:top w:val="single" w:color="9FB8CE" w:sz="4"/>
+              <w:left w:val="single" w:color="9FB8CE" w:sz="4"/>
+              <w:bottom w:val="single" w:color="9FB8CE" w:sz="4"/>
+              <w:right w:val="single" w:color="9FB8CE" w:sz="4"/>
+            </w:tcBorders>
+            <w:tcMar>
+              <w:top w:type="dxa" w:w="60"/>
+              <w:left w:type="dxa" w:w="100"/>
+              <w:bottom w:type="dxa" w:w="60"/>
+              <w:right w:type="dxa" w:w="100"/>
+            </w:tcMar>
+          </w:tcPr>
+          <w:p>
+            <w:r>
+              <w:rPr>
+                <w:rFonts w:ascii="Times New Roman" w:cs="Times New Roman" w:eastAsia="Times New Roman" w:hAnsi="Times New Roman"/>
+                <w:sz w:val="20"/>
+                <w:szCs w:val="20"/>
+              </w:rPr>
+              <w:t xml:space="preserve">Global</w:t>
+            </w:r>
+          </w:p>
+        </w:tc>
+        <w:tc>
+          <w:tcPr>
+            <w:tcW w:type="dxa" w:w="4926"/>
+            <w:tcBorders>
+              <w:top w:val="single" w:color="9FB8CE" w:sz="4"/>
+              <w:left w:val="single" w:color="9FB8CE" w:sz="4"/>
+              <w:bottom w:val="single" w:color="9FB8CE" w:sz="4"/>
+              <w:right w:val="single" w:color="9FB8CE" w:sz="4"/>
+            </w:tcBorders>
+            <w:tcMar>
+              <w:top w:type="dxa" w:w="60"/>
+              <w:left w:type="dxa" w:w="100"/>
+              <w:bottom w:type="dxa" w:w="60"/>
+              <w:right w:type="dxa" w:w="100"/>
+            </w:tcMar>
+          </w:tcPr>
+          <w:p>
+            <w:r>
+              <w:rPr>
+                <w:rFonts w:ascii="Times New Roman" w:cs="Times New Roman" w:eastAsia="Times New Roman" w:hAnsi="Times New Roman"/>
+                <w:sz w:val="20"/>
+                <w:szCs w:val="20"/>
+              </w:rPr>
+              <w:t xml:space="preserve">Texto bajo el título y foto de fondo de cada sección</w:t>
             </w:r>
           </w:p>
         </w:tc>
@@ -10551,27 +11347,7 @@
                 <w:sz w:val="20"/>
                 <w:szCs w:val="20"/>
               </w:rPr>
-              <w:t xml:space="preserve">NEXT</w:t>
-            </w:r>
-            <w:r>
-              <w:rPr>
-                <w:rFonts w:ascii="Times New Roman" w:cs="Times New Roman" w:eastAsia="Times New Roman" w:hAnsi="Times New Roman"/>
-                <w:b w:val="false"/>
-                <w:bCs w:val="false"/>
-                <w:i/>
-                <w:iCs/>
-                <w:sz w:val="20"/>
-                <w:szCs w:val="20"/>
-              </w:rPr>
-              <w:t xml:space="preserve">PUBLIC</w:t>
-            </w:r>
-            <w:r>
-              <w:rPr>
-                <w:rFonts w:ascii="Times New Roman" w:cs="Times New Roman" w:eastAsia="Times New Roman" w:hAnsi="Times New Roman"/>
-                <w:sz w:val="20"/>
-                <w:szCs w:val="20"/>
-              </w:rPr>
-              <w:t xml:space="preserve">SERVER_URL</w:t>
+              <w:t xml:space="preserve">NEXT_PUBLIC_SERVER_URL</w:t>
             </w:r>
           </w:p>
         </w:tc>
@@ -10630,67 +11406,7 @@
                 <w:sz w:val="20"/>
                 <w:szCs w:val="20"/>
               </w:rPr>
-              <w:t xml:space="preserve">CLOUDINARY</w:t>
-            </w:r>
-            <w:r>
-              <w:rPr>
-                <w:rFonts w:ascii="Times New Roman" w:cs="Times New Roman" w:eastAsia="Times New Roman" w:hAnsi="Times New Roman"/>
-                <w:b w:val="false"/>
-                <w:bCs w:val="false"/>
-                <w:i/>
-                <w:iCs/>
-                <w:sz w:val="20"/>
-                <w:szCs w:val="20"/>
-              </w:rPr>
-              <w:t xml:space="preserve">CLOUD</w:t>
-            </w:r>
-            <w:r>
-              <w:rPr>
-                <w:rFonts w:ascii="Times New Roman" w:cs="Times New Roman" w:eastAsia="Times New Roman" w:hAnsi="Times New Roman"/>
-                <w:sz w:val="20"/>
-                <w:szCs w:val="20"/>
-              </w:rPr>
-              <w:t xml:space="preserve">NAME, </w:t>
-            </w:r>
-            <w:r>
-              <w:rPr>
-                <w:rFonts w:ascii="Times New Roman" w:cs="Times New Roman" w:eastAsia="Times New Roman" w:hAnsi="Times New Roman"/>
-                <w:b w:val="false"/>
-                <w:bCs w:val="false"/>
-                <w:i/>
-                <w:iCs/>
-                <w:sz w:val="20"/>
-                <w:szCs w:val="20"/>
-              </w:rPr>
-              <w:t xml:space="preserve">API</w:t>
-            </w:r>
-            <w:r>
-              <w:rPr>
-                <w:rFonts w:ascii="Times New Roman" w:cs="Times New Roman" w:eastAsia="Times New Roman" w:hAnsi="Times New Roman"/>
-                <w:sz w:val="20"/>
-                <w:szCs w:val="20"/>
-              </w:rPr>
-              <w:t xml:space="preserve">KEY, </w:t>
-            </w:r>
-            <w:r>
-              <w:rPr>
-                <w:rFonts w:ascii="Times New Roman" w:cs="Times New Roman" w:eastAsia="Times New Roman" w:hAnsi="Times New Roman"/>
-                <w:b w:val="false"/>
-                <w:bCs w:val="false"/>
-                <w:i/>
-                <w:iCs/>
-                <w:sz w:val="20"/>
-                <w:szCs w:val="20"/>
-              </w:rPr>
-              <w:t xml:space="preserve">API</w:t>
-            </w:r>
-            <w:r>
-              <w:rPr>
-                <w:rFonts w:ascii="Times New Roman" w:cs="Times New Roman" w:eastAsia="Times New Roman" w:hAnsi="Times New Roman"/>
-                <w:sz w:val="20"/>
-                <w:szCs w:val="20"/>
-              </w:rPr>
-              <w:t xml:space="preserve">SECRET</w:t>
+              <w:t xml:space="preserve">CLOUDINARY_CLOUD_NAME, CLOUDINARY_API_KEY, CLOUDINARY_API_SECRET</w:t>
             </w:r>
           </w:p>
         </w:tc>
@@ -10749,27 +11465,7 @@
                 <w:sz w:val="20"/>
                 <w:szCs w:val="20"/>
               </w:rPr>
-              <w:t xml:space="preserve">PREVIEW</w:t>
-            </w:r>
-            <w:r>
-              <w:rPr>
-                <w:rFonts w:ascii="Times New Roman" w:cs="Times New Roman" w:eastAsia="Times New Roman" w:hAnsi="Times New Roman"/>
-                <w:b w:val="false"/>
-                <w:bCs w:val="false"/>
-                <w:i/>
-                <w:iCs/>
-                <w:sz w:val="20"/>
-                <w:szCs w:val="20"/>
-              </w:rPr>
-              <w:t xml:space="preserve">SECRET, CRON</w:t>
-            </w:r>
-            <w:r>
-              <w:rPr>
-                <w:rFonts w:ascii="Times New Roman" w:cs="Times New Roman" w:eastAsia="Times New Roman" w:hAnsi="Times New Roman"/>
-                <w:sz w:val="20"/>
-                <w:szCs w:val="20"/>
-              </w:rPr>
-              <w:t xml:space="preserve">SECRET</w:t>
+              <w:t xml:space="preserve">PREVIEW_SECRET, CRON_SECRET</w:t>
             </w:r>
           </w:p>
         </w:tc>
@@ -10797,6 +11493,183 @@
                 <w:szCs w:val="20"/>
               </w:rPr>
               <w:t xml:space="preserve">Protección de la vista previa y de las tareas programadas</w:t>
+            </w:r>
+          </w:p>
+        </w:tc>
+      </w:tr>
+      <w:tr>
+        <w:trPr>
+          <w:cantSplit/>
+        </w:trPr>
+        <w:tc>
+          <w:tcPr>
+            <w:tcW w:type="dxa" w:w="4000"/>
+            <w:tcBorders>
+              <w:top w:val="single" w:color="9FB8CE" w:sz="4"/>
+              <w:left w:val="single" w:color="9FB8CE" w:sz="4"/>
+              <w:bottom w:val="single" w:color="9FB8CE" w:sz="4"/>
+              <w:right w:val="single" w:color="9FB8CE" w:sz="4"/>
+            </w:tcBorders>
+            <w:tcMar>
+              <w:top w:type="dxa" w:w="60"/>
+              <w:left w:type="dxa" w:w="100"/>
+              <w:bottom w:type="dxa" w:w="60"/>
+              <w:right w:type="dxa" w:w="100"/>
+            </w:tcMar>
+          </w:tcPr>
+          <w:p>
+            <w:r>
+              <w:rPr>
+                <w:rFonts w:ascii="Times New Roman" w:cs="Times New Roman" w:eastAsia="Times New Roman" w:hAnsi="Times New Roman"/>
+                <w:sz w:val="20"/>
+                <w:szCs w:val="20"/>
+              </w:rPr>
+              <w:t xml:space="preserve">ADMIN_ALLOWED_IPS</w:t>
+            </w:r>
+          </w:p>
+        </w:tc>
+        <w:tc>
+          <w:tcPr>
+            <w:tcW w:type="dxa" w:w="5026"/>
+            <w:tcBorders>
+              <w:top w:val="single" w:color="9FB8CE" w:sz="4"/>
+              <w:left w:val="single" w:color="9FB8CE" w:sz="4"/>
+              <w:bottom w:val="single" w:color="9FB8CE" w:sz="4"/>
+              <w:right w:val="single" w:color="9FB8CE" w:sz="4"/>
+            </w:tcBorders>
+            <w:tcMar>
+              <w:top w:type="dxa" w:w="60"/>
+              <w:left w:type="dxa" w:w="100"/>
+              <w:bottom w:type="dxa" w:w="60"/>
+              <w:right w:type="dxa" w:w="100"/>
+            </w:tcMar>
+          </w:tcPr>
+          <w:p>
+            <w:r>
+              <w:rPr>
+                <w:rFonts w:ascii="Times New Roman" w:cs="Times New Roman" w:eastAsia="Times New Roman" w:hAnsi="Times New Roman"/>
+                <w:sz w:val="20"/>
+                <w:szCs w:val="20"/>
+              </w:rPr>
+              <w:t xml:space="preserve">IPs o rangos que pueden entrar al panel y a la API</w:t>
+            </w:r>
+          </w:p>
+        </w:tc>
+      </w:tr>
+      <w:tr>
+        <w:trPr>
+          <w:cantSplit/>
+        </w:trPr>
+        <w:tc>
+          <w:tcPr>
+            <w:tcW w:type="dxa" w:w="4000"/>
+            <w:tcBorders>
+              <w:top w:val="single" w:color="9FB8CE" w:sz="4"/>
+              <w:left w:val="single" w:color="9FB8CE" w:sz="4"/>
+              <w:bottom w:val="single" w:color="9FB8CE" w:sz="4"/>
+              <w:right w:val="single" w:color="9FB8CE" w:sz="4"/>
+            </w:tcBorders>
+            <w:tcMar>
+              <w:top w:type="dxa" w:w="60"/>
+              <w:left w:type="dxa" w:w="100"/>
+              <w:bottom w:type="dxa" w:w="60"/>
+              <w:right w:type="dxa" w:w="100"/>
+            </w:tcMar>
+          </w:tcPr>
+          <w:p>
+            <w:r>
+              <w:rPr>
+                <w:rFonts w:ascii="Times New Roman" w:cs="Times New Roman" w:eastAsia="Times New Roman" w:hAnsi="Times New Roman"/>
+                <w:sz w:val="20"/>
+                <w:szCs w:val="20"/>
+              </w:rPr>
+              <w:t xml:space="preserve">SMTP_HOST, SMTP_PORT, SMTP_USER, SMTP_PASS, SMTP_FROM_ADDRESS, SMTP_FROM_NAME</w:t>
+            </w:r>
+          </w:p>
+        </w:tc>
+        <w:tc>
+          <w:tcPr>
+            <w:tcW w:type="dxa" w:w="5026"/>
+            <w:tcBorders>
+              <w:top w:val="single" w:color="9FB8CE" w:sz="4"/>
+              <w:left w:val="single" w:color="9FB8CE" w:sz="4"/>
+              <w:bottom w:val="single" w:color="9FB8CE" w:sz="4"/>
+              <w:right w:val="single" w:color="9FB8CE" w:sz="4"/>
+            </w:tcBorders>
+            <w:tcMar>
+              <w:top w:type="dxa" w:w="60"/>
+              <w:left w:type="dxa" w:w="100"/>
+              <w:bottom w:type="dxa" w:w="60"/>
+              <w:right w:type="dxa" w:w="100"/>
+            </w:tcMar>
+          </w:tcPr>
+          <w:p>
+            <w:r>
+              <w:rPr>
+                <w:rFonts w:ascii="Times New Roman" w:cs="Times New Roman" w:eastAsia="Times New Roman" w:hAnsi="Times New Roman"/>
+                <w:sz w:val="20"/>
+                <w:szCs w:val="20"/>
+              </w:rPr>
+              <w:t xml:space="preserve">Servidor de correo para los avisos del formulario de contacto</w:t>
+            </w:r>
+          </w:p>
+        </w:tc>
+      </w:tr>
+      <w:tr>
+        <w:trPr>
+          <w:cantSplit/>
+        </w:trPr>
+        <w:tc>
+          <w:tcPr>
+            <w:tcW w:type="dxa" w:w="4000"/>
+            <w:tcBorders>
+              <w:top w:val="single" w:color="9FB8CE" w:sz="4"/>
+              <w:left w:val="single" w:color="9FB8CE" w:sz="4"/>
+              <w:bottom w:val="single" w:color="9FB8CE" w:sz="4"/>
+              <w:right w:val="single" w:color="9FB8CE" w:sz="4"/>
+            </w:tcBorders>
+            <w:tcMar>
+              <w:top w:type="dxa" w:w="60"/>
+              <w:left w:type="dxa" w:w="100"/>
+              <w:bottom w:type="dxa" w:w="60"/>
+              <w:right w:type="dxa" w:w="100"/>
+            </w:tcMar>
+          </w:tcPr>
+          <w:p>
+            <w:r>
+              <w:rPr>
+                <w:rFonts w:ascii="Times New Roman" w:cs="Times New Roman" w:eastAsia="Times New Roman" w:hAnsi="Times New Roman"/>
+                <w:sz w:val="20"/>
+                <w:szCs w:val="20"/>
+              </w:rPr>
+              <w:t xml:space="preserve">GOOGLE_SITE_VERIFICATION, BING_SITE_VERIFICATION</w:t>
+            </w:r>
+          </w:p>
+        </w:tc>
+        <w:tc>
+          <w:tcPr>
+            <w:tcW w:type="dxa" w:w="5026"/>
+            <w:tcBorders>
+              <w:top w:val="single" w:color="9FB8CE" w:sz="4"/>
+              <w:left w:val="single" w:color="9FB8CE" w:sz="4"/>
+              <w:bottom w:val="single" w:color="9FB8CE" w:sz="4"/>
+              <w:right w:val="single" w:color="9FB8CE" w:sz="4"/>
+            </w:tcBorders>
+            <w:tcMar>
+              <w:top w:type="dxa" w:w="60"/>
+              <w:left w:type="dxa" w:w="100"/>
+              <w:bottom w:type="dxa" w:w="60"/>
+              <w:right w:type="dxa" w:w="100"/>
+            </w:tcMar>
+          </w:tcPr>
+          <w:p>
+            <w:r>
+              <w:rPr>
+                <w:rFonts w:ascii="Times New Roman" w:cs="Times New Roman" w:eastAsia="Times New Roman" w:hAnsi="Times New Roman"/>
+                <w:sz w:val="20"/>
+                <w:szCs w:val="20"/>
+              </w:rPr>
+              <w:t xml:space="preserve">Verificación del sitio en Google Search Console y Bing</w:t>
             </w:r>
           </w:p>
         </w:tc>
@@ -10839,7 +11712,7 @@
           <w:sz w:val="24"/>
           <w:szCs w:val="24"/>
         </w:rPr>
-        <w:t xml:space="preserve">El manual de usuario para los editores del centro, con 24 capturas del panel y los pasos de cada tarea, se entrega por separado en el archivo «Manual-de-usuario-sitio-web-CEAC.pdf», incluido también en la carpeta docs del repositorio del proyecto.</w:t>
+        <w:t xml:space="preserve">El manual de usuario para los editores del centro, con 24 capturas del panel y los pasos de cada tarea, se entrega por separado en el archivo «Manual-de-usuario-sitio-web-CEAC.pdf», junto con el complemento «Manual-de-usuario-novedades.pdf», que explica las funciones añadidas en octubre de 2026. Ambos están en la carpeta docs del repositorio del sitio.</w:t>
       </w:r>
     </w:p>
     <w:sectPr>

</xml_diff>